<commit_message>
TS 4.6 Tamil and Sanskrit Kramam final PDF
</commit_message>
<xml_diff>
--- a/TS-Kramam/TS-4.6/TS 4.6 Tamil Krama Paatam Corrections.docx
+++ b/TS-Kramam/TS-4.6/TS 4.6 Tamil Krama Paatam Corrections.docx
@@ -8,9 +8,6 @@
         <w:rPr>
           <w:b/>
           <w:bCs/>
-          <w:sz w:val="32"/>
-          <w:szCs w:val="32"/>
-          <w:u w:val="single"/>
         </w:rPr>
       </w:pPr>
       <w:r>
@@ -89,21 +86,24 @@
           <w:bCs/>
           <w:sz w:val="32"/>
           <w:szCs w:val="32"/>
-          <w:highlight w:val="red"/>
           <w:u w:val="single"/>
         </w:rPr>
-        <w:t>????</w:t>
+        <w:t>30th Sep 2026</w:t>
       </w:r>
-    </w:p>
-    <w:p>
-      <w:pPr>
-        <w:spacing w:before="0" w:line="240" w:lineRule="auto"/>
-        <w:jc w:val="center"/>
+      <w:r>
         <w:rPr>
           <w:b/>
           <w:bCs/>
         </w:rPr>
-      </w:pPr>
+        <w:t xml:space="preserve"> </w:t>
+      </w:r>
+      <w:r>
+        <w:rPr>
+          <w:b/>
+          <w:bCs/>
+        </w:rPr>
+        <w:br/>
+      </w:r>
       <w:r>
         <w:rPr>
           <w:b/>
@@ -6698,7 +6698,7 @@
                 <w:sz w:val="28"/>
                 <w:szCs w:val="32"/>
               </w:rPr>
-              <w:t>9.2</w:t>
+              <w:t>9.4</w:t>
             </w:r>
             <w:r>
               <w:rPr>
@@ -6737,17 +6737,7 @@
                 <w:szCs w:val="32"/>
                 <w:lang w:val="en-IN"/>
               </w:rPr>
-              <w:t xml:space="preserve">Krama Vaakyam No.– </w:t>
-            </w:r>
-            <w:r>
-              <w:rPr>
-                <w:rFonts w:cs="Arial"/>
-                <w:b/>
-                <w:sz w:val="28"/>
-                <w:szCs w:val="32"/>
-                <w:lang w:val="en-IN"/>
-              </w:rPr>
-              <w:t>15</w:t>
+              <w:t>Krama Vaakyam No.– 23</w:t>
             </w:r>
           </w:p>
           <w:p>
@@ -6766,6 +6756,7 @@
                 <w:b/>
                 <w:sz w:val="28"/>
                 <w:szCs w:val="32"/>
+                <w:lang w:val="it-IT"/>
               </w:rPr>
             </w:pPr>
             <w:r>
@@ -6795,7 +6786,7 @@
                 <w:szCs w:val="32"/>
                 <w:lang w:val="it-IT"/>
               </w:rPr>
-              <w:t>44</w:t>
+              <w:t>46</w:t>
             </w:r>
           </w:p>
         </w:tc>
@@ -6811,6 +6802,15 @@
               <w:adjustRightInd w:val="0"/>
               <w:spacing w:before="0" w:line="240" w:lineRule="auto"/>
               <w:rPr>
+                <w:rFonts w:ascii="BRH Malayalam Extra" w:eastAsia="Times New Roman" w:hAnsi="BRH Malayalam Extra" w:cs="BRH Malayalam Extra"/>
+                <w:color w:val="000000"/>
+                <w:sz w:val="40"/>
+                <w:szCs w:val="40"/>
+                <w:lang w:val="en-IN" w:eastAsia="en-IN" w:bidi="ml-IN"/>
+              </w:rPr>
+            </w:pPr>
+            <w:r>
+              <w:rPr>
                 <w:rFonts w:ascii="Latha" w:hAnsi="Latha" w:cs="Latha"/>
                 <w:sz w:val="28"/>
                 <w:szCs w:val="28"/>
@@ -6818,55 +6818,15 @@
                 <w:cs/>
                 <w:lang w:bidi="ta-IN"/>
               </w:rPr>
-            </w:pPr>
-            <w:r>
-              <w:rPr>
-                <w:rFonts w:ascii="Latha" w:hAnsi="Latha" w:cs="Latha"/>
-                <w:sz w:val="28"/>
-                <w:szCs w:val="28"/>
-                <w:cs/>
-                <w:lang w:bidi="ta-IN"/>
-              </w:rPr>
-              <w:t>மோகா</w:t>
-            </w:r>
-            <w:r>
-              <w:rPr>
-                <w:rFonts w:ascii="Latha" w:hAnsi="Latha" w:cs="Latha"/>
-                <w:b/>
-                <w:bCs/>
-                <w:position w:val="-12"/>
-                <w:sz w:val="28"/>
-                <w:szCs w:val="28"/>
-                <w:cs/>
-                <w:lang w:bidi="ta-IN"/>
-              </w:rPr>
-              <w:t>2</w:t>
-            </w:r>
-            <w:r>
-              <w:rPr>
-                <w:rFonts w:ascii="Latha" w:hAnsi="Latha" w:cs="Latha"/>
-                <w:sz w:val="28"/>
-                <w:szCs w:val="28"/>
-                <w:lang w:bidi="ta-IN"/>
-              </w:rPr>
-              <w:t xml:space="preserve"> | </w:t>
-            </w:r>
-            <w:r>
-              <w:rPr>
-                <w:rFonts w:ascii="Latha" w:hAnsi="Latha" w:cs="Latha"/>
-                <w:sz w:val="28"/>
-                <w:szCs w:val="28"/>
-                <w:cs/>
-                <w:lang w:bidi="ta-IN"/>
-              </w:rPr>
-              <w:t>உ</w:t>
-            </w:r>
-            <w:r>
-              <w:rPr>
-                <w:rFonts w:ascii="BRH Tamil Tab Extra" w:hAnsi="BRH Tamil Tab Extra" w:cs="brh"/>
-                <w:b/>
-                <w:sz w:val="32"/>
-                <w:szCs w:val="28"/>
+              <w:t>க</w:t>
+            </w:r>
+            <w:r>
+              <w:rPr>
+                <w:rFonts w:ascii="BRH Tamil Tab Extra" w:hAnsi="BRH Tamil Tab Extra" w:cs="brh"/>
+                <w:b/>
+                <w:sz w:val="32"/>
+                <w:szCs w:val="28"/>
+                <w:highlight w:val="yellow"/>
                 <w:lang w:bidi="ta-IN"/>
               </w:rPr>
               <w:t>…</w:t>
@@ -6876,29 +6836,7 @@
                 <w:rFonts w:ascii="Latha" w:hAnsi="Latha" w:cs="Latha"/>
                 <w:sz w:val="28"/>
                 <w:szCs w:val="28"/>
-                <w:cs/>
-                <w:lang w:bidi="ta-IN"/>
-              </w:rPr>
-              <w:t>கா</w:t>
-            </w:r>
-            <w:r>
-              <w:rPr>
-                <w:rFonts w:ascii="Latha" w:hAnsi="Latha" w:cs="Latha"/>
-                <w:b/>
-                <w:bCs/>
-                <w:position w:val="-12"/>
-                <w:sz w:val="28"/>
-                <w:szCs w:val="28"/>
-                <w:cs/>
-                <w:lang w:bidi="ta-IN"/>
-              </w:rPr>
-              <w:t>2</w:t>
-            </w:r>
-            <w:r>
-              <w:rPr>
-                <w:rFonts w:ascii="Latha" w:hAnsi="Latha" w:cs="Latha"/>
-                <w:sz w:val="28"/>
-                <w:szCs w:val="28"/>
+                <w:highlight w:val="yellow"/>
                 <w:lang w:bidi="ta-IN"/>
               </w:rPr>
               <w:t xml:space="preserve"> </w:t>
@@ -6908,43 +6846,21 @@
                 <w:rFonts w:ascii="Latha" w:hAnsi="Latha" w:cs="Latha"/>
                 <w:sz w:val="28"/>
                 <w:szCs w:val="28"/>
-                <w:cs/>
-                <w:lang w:bidi="ta-IN"/>
-              </w:rPr>
-              <w:t>ப்</w:t>
-            </w:r>
-            <w:r>
-              <w:rPr>
-                <w:rFonts w:ascii="Latha" w:hAnsi="Latha" w:cs="Latha"/>
-                <w:b/>
-                <w:bCs/>
-                <w:position w:val="-12"/>
-                <w:sz w:val="28"/>
-                <w:szCs w:val="28"/>
-                <w:cs/>
-                <w:lang w:bidi="ta-IN"/>
-              </w:rPr>
-              <w:t>4</w:t>
-            </w:r>
-            <w:r>
-              <w:rPr>
-                <w:rFonts w:ascii="Latha" w:hAnsi="Latha" w:cs="Latha"/>
-                <w:sz w:val="28"/>
-                <w:szCs w:val="28"/>
-                <w:cs/>
-                <w:lang w:bidi="ta-IN"/>
-              </w:rPr>
-              <w:t>ரா</w:t>
-            </w:r>
-            <w:r>
-              <w:rPr>
-                <w:rFonts w:ascii="Latha" w:hAnsi="Latha" w:cs="Latha"/>
-                <w:sz w:val="28"/>
-                <w:szCs w:val="28"/>
-                <w:cs/>
-                <w:lang w:bidi="ta-IN"/>
-              </w:rPr>
-              <w:t>ஜ</w:t>
+                <w:highlight w:val="yellow"/>
+                <w:cs/>
+                <w:lang w:bidi="ta-IN"/>
+              </w:rPr>
+              <w:t>இ</w:t>
+            </w:r>
+            <w:r>
+              <w:rPr>
+                <w:rFonts w:ascii="Latha" w:hAnsi="Latha" w:cs="Latha"/>
+                <w:sz w:val="28"/>
+                <w:szCs w:val="28"/>
+                <w:cs/>
+                <w:lang w:bidi="ta-IN"/>
+              </w:rPr>
+              <w:t>தி</w:t>
             </w:r>
             <w:r>
               <w:rPr>
@@ -6952,7 +6868,6 @@
                 <w:b/>
                 <w:sz w:val="36"/>
                 <w:szCs w:val="28"/>
-                <w:highlight w:val="yellow"/>
                 <w:lang w:bidi="ta-IN"/>
               </w:rPr>
               <w:t>†</w:t>
@@ -6962,20 +6877,40 @@
                 <w:rFonts w:ascii="Latha" w:hAnsi="Latha" w:cs="Latha"/>
                 <w:sz w:val="28"/>
                 <w:szCs w:val="28"/>
-                <w:highlight w:val="yellow"/>
-                <w:cs/>
-                <w:lang w:bidi="ta-IN"/>
-              </w:rPr>
-              <w:t>ந்தி</w:t>
-            </w:r>
-            <w:r>
-              <w:rPr>
-                <w:rFonts w:ascii="Latha" w:hAnsi="Latha" w:cs="Latha"/>
-                <w:sz w:val="28"/>
-                <w:szCs w:val="28"/>
-                <w:lang w:bidi="ta-IN"/>
-              </w:rPr>
-              <w:t xml:space="preserve"> |</w:t>
+                <w:lang w:bidi="ta-IN"/>
+              </w:rPr>
+              <w:t xml:space="preserve"> </w:t>
+            </w:r>
+            <w:r>
+              <w:rPr>
+                <w:rFonts w:ascii="Latha" w:hAnsi="Latha" w:cs="Latha"/>
+                <w:sz w:val="28"/>
+                <w:szCs w:val="28"/>
+                <w:cs/>
+                <w:lang w:bidi="ta-IN"/>
+              </w:rPr>
+              <w:t>க</w:t>
+            </w:r>
+            <w:r>
+              <w:rPr>
+                <w:rFonts w:ascii="Latha" w:hAnsi="Latha" w:cs="Latha"/>
+                <w:b/>
+                <w:bCs/>
+                <w:sz w:val="32"/>
+                <w:szCs w:val="32"/>
+                <w:cs/>
+                <w:lang w:bidi="ta-IN"/>
+              </w:rPr>
+              <w:t>:</w:t>
+            </w:r>
+            <w:r>
+              <w:rPr>
+                <w:rFonts w:ascii="Latha" w:hAnsi="Latha" w:cs="Latha"/>
+                <w:sz w:val="28"/>
+                <w:szCs w:val="28"/>
+                <w:lang w:bidi="ta-IN"/>
+              </w:rPr>
+              <w:t xml:space="preserve"> ||</w:t>
             </w:r>
           </w:p>
         </w:tc>
@@ -6991,434 +6926,6 @@
               <w:adjustRightInd w:val="0"/>
               <w:spacing w:before="0" w:line="240" w:lineRule="auto"/>
               <w:rPr>
-                <w:rFonts w:ascii="Latha" w:hAnsi="Latha" w:cs="Latha"/>
-                <w:sz w:val="28"/>
-                <w:szCs w:val="28"/>
-                <w:cs/>
-                <w:lang w:bidi="ta-IN"/>
-              </w:rPr>
-            </w:pPr>
-            <w:r>
-              <w:rPr>
-                <w:rFonts w:ascii="Latha" w:hAnsi="Latha" w:cs="Latha"/>
-                <w:sz w:val="28"/>
-                <w:szCs w:val="28"/>
-                <w:cs/>
-                <w:lang w:bidi="ta-IN"/>
-              </w:rPr>
-              <w:t>மோகா</w:t>
-            </w:r>
-            <w:r>
-              <w:rPr>
-                <w:rFonts w:ascii="Latha" w:hAnsi="Latha" w:cs="Latha"/>
-                <w:b/>
-                <w:bCs/>
-                <w:position w:val="-12"/>
-                <w:sz w:val="28"/>
-                <w:szCs w:val="28"/>
-                <w:cs/>
-                <w:lang w:bidi="ta-IN"/>
-              </w:rPr>
-              <w:t>2</w:t>
-            </w:r>
-            <w:r>
-              <w:rPr>
-                <w:rFonts w:ascii="Latha" w:hAnsi="Latha" w:cs="Latha"/>
-                <w:sz w:val="28"/>
-                <w:szCs w:val="28"/>
-                <w:lang w:bidi="ta-IN"/>
-              </w:rPr>
-              <w:t xml:space="preserve"> | </w:t>
-            </w:r>
-            <w:r>
-              <w:rPr>
-                <w:rFonts w:ascii="Latha" w:hAnsi="Latha" w:cs="Latha"/>
-                <w:sz w:val="28"/>
-                <w:szCs w:val="28"/>
-                <w:cs/>
-                <w:lang w:bidi="ta-IN"/>
-              </w:rPr>
-              <w:t>உ</w:t>
-            </w:r>
-            <w:r>
-              <w:rPr>
-                <w:rFonts w:ascii="BRH Tamil Tab Extra" w:hAnsi="BRH Tamil Tab Extra" w:cs="brh"/>
-                <w:b/>
-                <w:sz w:val="32"/>
-                <w:szCs w:val="28"/>
-                <w:lang w:bidi="ta-IN"/>
-              </w:rPr>
-              <w:t>…</w:t>
-            </w:r>
-            <w:r>
-              <w:rPr>
-                <w:rFonts w:ascii="Latha" w:hAnsi="Latha" w:cs="Latha"/>
-                <w:sz w:val="28"/>
-                <w:szCs w:val="28"/>
-                <w:cs/>
-                <w:lang w:bidi="ta-IN"/>
-              </w:rPr>
-              <w:t>கா</w:t>
-            </w:r>
-            <w:r>
-              <w:rPr>
-                <w:rFonts w:ascii="Latha" w:hAnsi="Latha" w:cs="Latha"/>
-                <w:b/>
-                <w:bCs/>
-                <w:position w:val="-12"/>
-                <w:sz w:val="28"/>
-                <w:szCs w:val="28"/>
-                <w:cs/>
-                <w:lang w:bidi="ta-IN"/>
-              </w:rPr>
-              <w:t>2</w:t>
-            </w:r>
-            <w:r>
-              <w:rPr>
-                <w:rFonts w:ascii="Latha" w:hAnsi="Latha" w:cs="Latha"/>
-                <w:sz w:val="28"/>
-                <w:szCs w:val="28"/>
-                <w:lang w:bidi="ta-IN"/>
-              </w:rPr>
-              <w:t xml:space="preserve"> </w:t>
-            </w:r>
-            <w:r>
-              <w:rPr>
-                <w:rFonts w:ascii="Latha" w:hAnsi="Latha" w:cs="Latha"/>
-                <w:sz w:val="28"/>
-                <w:szCs w:val="28"/>
-                <w:cs/>
-                <w:lang w:bidi="ta-IN"/>
-              </w:rPr>
-              <w:t>ப்</w:t>
-            </w:r>
-            <w:r>
-              <w:rPr>
-                <w:rFonts w:ascii="Latha" w:hAnsi="Latha" w:cs="Latha"/>
-                <w:b/>
-                <w:bCs/>
-                <w:position w:val="-12"/>
-                <w:sz w:val="28"/>
-                <w:szCs w:val="28"/>
-                <w:cs/>
-                <w:lang w:bidi="ta-IN"/>
-              </w:rPr>
-              <w:t>4</w:t>
-            </w:r>
-            <w:r>
-              <w:rPr>
-                <w:rFonts w:ascii="Latha" w:hAnsi="Latha" w:cs="Latha"/>
-                <w:sz w:val="28"/>
-                <w:szCs w:val="28"/>
-                <w:cs/>
-                <w:lang w:bidi="ta-IN"/>
-              </w:rPr>
-              <w:t>ராஜ</w:t>
-            </w:r>
-            <w:r>
-              <w:rPr>
-                <w:rFonts w:ascii="BRH Tamil Tab Extra" w:hAnsi="BRH Tamil Tab Extra" w:cs="brh"/>
-                <w:b/>
-                <w:sz w:val="36"/>
-                <w:szCs w:val="28"/>
-                <w:highlight w:val="green"/>
-                <w:lang w:bidi="ta-IN"/>
-              </w:rPr>
-              <w:t>†</w:t>
-            </w:r>
-            <w:r>
-              <w:rPr>
-                <w:rFonts w:ascii="Latha" w:hAnsi="Latha" w:cs="Latha"/>
-                <w:sz w:val="28"/>
-                <w:szCs w:val="28"/>
-                <w:highlight w:val="green"/>
-                <w:cs/>
-                <w:lang w:bidi="ta-IN"/>
-              </w:rPr>
-              <w:t>ந்தீ</w:t>
-            </w:r>
-            <w:r>
-              <w:rPr>
-                <w:rFonts w:ascii="Latha" w:hAnsi="Latha" w:cs="Latha"/>
-                <w:sz w:val="28"/>
-                <w:szCs w:val="28"/>
-                <w:lang w:bidi="ta-IN"/>
-              </w:rPr>
-              <w:t xml:space="preserve"> |</w:t>
-            </w:r>
-          </w:p>
-        </w:tc>
-      </w:tr>
-      <w:tr>
-        <w:trPr>
-          <w:trHeight w:val="1118"/>
-        </w:trPr>
-        <w:tc>
-          <w:tcPr>
-            <w:tcW w:w="3906" w:type="dxa"/>
-          </w:tcPr>
-          <w:p>
-            <w:pPr>
-              <w:widowControl w:val="0"/>
-              <w:tabs>
-                <w:tab w:val="left" w:pos="993"/>
-              </w:tabs>
-              <w:autoSpaceDE w:val="0"/>
-              <w:autoSpaceDN w:val="0"/>
-              <w:adjustRightInd w:val="0"/>
-              <w:spacing w:before="0" w:line="252" w:lineRule="auto"/>
-              <w:ind w:right="297"/>
-              <w:rPr>
-                <w:rFonts w:cs="Arial"/>
-                <w:b/>
-                <w:sz w:val="28"/>
-                <w:szCs w:val="32"/>
-              </w:rPr>
-            </w:pPr>
-            <w:r>
-              <w:rPr>
-                <w:rFonts w:cs="Arial"/>
-                <w:b/>
-                <w:sz w:val="28"/>
-                <w:szCs w:val="32"/>
-              </w:rPr>
-              <w:t>T.S.4.6.</w:t>
-            </w:r>
-            <w:r>
-              <w:rPr>
-                <w:rFonts w:cs="Arial"/>
-                <w:b/>
-                <w:sz w:val="28"/>
-                <w:szCs w:val="32"/>
-              </w:rPr>
-              <w:t>9.4</w:t>
-            </w:r>
-            <w:r>
-              <w:rPr>
-                <w:rFonts w:cs="Arial"/>
-                <w:b/>
-                <w:sz w:val="28"/>
-                <w:szCs w:val="32"/>
-              </w:rPr>
-              <w:t xml:space="preserve"> – Kramam</w:t>
-            </w:r>
-          </w:p>
-          <w:p>
-            <w:pPr>
-              <w:widowControl w:val="0"/>
-              <w:tabs>
-                <w:tab w:val="left" w:pos="993"/>
-              </w:tabs>
-              <w:autoSpaceDE w:val="0"/>
-              <w:autoSpaceDN w:val="0"/>
-              <w:adjustRightInd w:val="0"/>
-              <w:spacing w:before="0" w:line="252" w:lineRule="auto"/>
-              <w:ind w:right="297"/>
-              <w:rPr>
-                <w:rFonts w:cs="Arial"/>
-                <w:b/>
-                <w:sz w:val="28"/>
-                <w:szCs w:val="32"/>
-                <w:lang w:val="en-IN"/>
-              </w:rPr>
-            </w:pPr>
-            <w:r>
-              <w:rPr>
-                <w:rFonts w:cs="Arial"/>
-                <w:b/>
-                <w:sz w:val="28"/>
-                <w:szCs w:val="32"/>
-                <w:lang w:val="en-IN"/>
-              </w:rPr>
-              <w:t>Krama Vaakyam No.– 23</w:t>
-            </w:r>
-          </w:p>
-          <w:p>
-            <w:pPr>
-              <w:widowControl w:val="0"/>
-              <w:tabs>
-                <w:tab w:val="left" w:pos="993"/>
-              </w:tabs>
-              <w:autoSpaceDE w:val="0"/>
-              <w:autoSpaceDN w:val="0"/>
-              <w:adjustRightInd w:val="0"/>
-              <w:spacing w:before="0" w:line="252" w:lineRule="auto"/>
-              <w:ind w:right="297"/>
-              <w:rPr>
-                <w:rFonts w:cs="Arial"/>
-                <w:b/>
-                <w:sz w:val="28"/>
-                <w:szCs w:val="32"/>
-                <w:lang w:val="it-IT"/>
-              </w:rPr>
-            </w:pPr>
-            <w:r>
-              <w:rPr>
-                <w:rFonts w:cs="Arial"/>
-                <w:b/>
-                <w:sz w:val="28"/>
-                <w:szCs w:val="32"/>
-                <w:lang w:val="it-IT"/>
-              </w:rPr>
-              <w:t>Panchaati No</w:t>
-            </w:r>
-            <w:r>
-              <w:rPr>
-                <w:rFonts w:cs="Arial"/>
-                <w:b/>
-                <w:szCs w:val="32"/>
-                <w:lang w:val="it-IT"/>
-              </w:rPr>
-              <w:t xml:space="preserve">. - </w:t>
-            </w:r>
-            <w:r>
-              <w:rPr>
-                <w:rFonts w:cs="Arial"/>
-                <w:b/>
-                <w:sz w:val="28"/>
-                <w:szCs w:val="32"/>
-                <w:lang w:val="it-IT"/>
-              </w:rPr>
-              <w:t>46</w:t>
-            </w:r>
-          </w:p>
-        </w:tc>
-        <w:tc>
-          <w:tcPr>
-            <w:tcW w:w="5103" w:type="dxa"/>
-          </w:tcPr>
-          <w:p>
-            <w:pPr>
-              <w:widowControl w:val="0"/>
-              <w:autoSpaceDE w:val="0"/>
-              <w:autoSpaceDN w:val="0"/>
-              <w:adjustRightInd w:val="0"/>
-              <w:spacing w:before="0" w:line="240" w:lineRule="auto"/>
-              <w:rPr>
-                <w:rFonts w:ascii="BRH Malayalam Extra" w:eastAsia="Times New Roman" w:hAnsi="BRH Malayalam Extra" w:cs="BRH Malayalam Extra"/>
-                <w:color w:val="000000"/>
-                <w:sz w:val="40"/>
-                <w:szCs w:val="40"/>
-                <w:lang w:val="en-IN" w:eastAsia="en-IN" w:bidi="ml-IN"/>
-              </w:rPr>
-            </w:pPr>
-            <w:r>
-              <w:rPr>
-                <w:rFonts w:ascii="Latha" w:hAnsi="Latha" w:cs="Latha"/>
-                <w:sz w:val="28"/>
-                <w:szCs w:val="28"/>
-                <w:highlight w:val="yellow"/>
-                <w:cs/>
-                <w:lang w:bidi="ta-IN"/>
-              </w:rPr>
-              <w:t>க</w:t>
-            </w:r>
-            <w:r>
-              <w:rPr>
-                <w:rFonts w:ascii="BRH Tamil Tab Extra" w:hAnsi="BRH Tamil Tab Extra" w:cs="brh"/>
-                <w:b/>
-                <w:sz w:val="32"/>
-                <w:szCs w:val="28"/>
-                <w:highlight w:val="yellow"/>
-                <w:lang w:bidi="ta-IN"/>
-              </w:rPr>
-              <w:t>…</w:t>
-            </w:r>
-            <w:r>
-              <w:rPr>
-                <w:rFonts w:ascii="Latha" w:hAnsi="Latha" w:cs="Latha"/>
-                <w:sz w:val="28"/>
-                <w:szCs w:val="28"/>
-                <w:highlight w:val="yellow"/>
-                <w:lang w:bidi="ta-IN"/>
-              </w:rPr>
-              <w:t xml:space="preserve"> </w:t>
-            </w:r>
-            <w:r>
-              <w:rPr>
-                <w:rFonts w:ascii="Latha" w:hAnsi="Latha" w:cs="Latha"/>
-                <w:sz w:val="28"/>
-                <w:szCs w:val="28"/>
-                <w:highlight w:val="yellow"/>
-                <w:cs/>
-                <w:lang w:bidi="ta-IN"/>
-              </w:rPr>
-              <w:t>இ</w:t>
-            </w:r>
-            <w:r>
-              <w:rPr>
-                <w:rFonts w:ascii="Latha" w:hAnsi="Latha" w:cs="Latha"/>
-                <w:sz w:val="28"/>
-                <w:szCs w:val="28"/>
-                <w:cs/>
-                <w:lang w:bidi="ta-IN"/>
-              </w:rPr>
-              <w:t>தி</w:t>
-            </w:r>
-            <w:r>
-              <w:rPr>
-                <w:rFonts w:ascii="BRH Tamil Tab Extra" w:hAnsi="BRH Tamil Tab Extra" w:cs="brh"/>
-                <w:b/>
-                <w:sz w:val="36"/>
-                <w:szCs w:val="28"/>
-                <w:lang w:bidi="ta-IN"/>
-              </w:rPr>
-              <w:t>†</w:t>
-            </w:r>
-            <w:r>
-              <w:rPr>
-                <w:rFonts w:ascii="Latha" w:hAnsi="Latha" w:cs="Latha"/>
-                <w:sz w:val="28"/>
-                <w:szCs w:val="28"/>
-                <w:lang w:bidi="ta-IN"/>
-              </w:rPr>
-              <w:t xml:space="preserve"> </w:t>
-            </w:r>
-            <w:r>
-              <w:rPr>
-                <w:rFonts w:ascii="Latha" w:hAnsi="Latha" w:cs="Latha"/>
-                <w:sz w:val="28"/>
-                <w:szCs w:val="28"/>
-                <w:cs/>
-                <w:lang w:bidi="ta-IN"/>
-              </w:rPr>
-              <w:t>க</w:t>
-            </w:r>
-            <w:r>
-              <w:rPr>
-                <w:rFonts w:ascii="Latha" w:hAnsi="Latha" w:cs="Latha"/>
-                <w:b/>
-                <w:bCs/>
-                <w:sz w:val="32"/>
-                <w:szCs w:val="32"/>
-                <w:cs/>
-                <w:lang w:bidi="ta-IN"/>
-              </w:rPr>
-              <w:t>:</w:t>
-            </w:r>
-            <w:r>
-              <w:rPr>
-                <w:rFonts w:ascii="Latha" w:hAnsi="Latha" w:cs="Latha"/>
-                <w:sz w:val="28"/>
-                <w:szCs w:val="28"/>
-                <w:lang w:bidi="ta-IN"/>
-              </w:rPr>
-              <w:t xml:space="preserve"> ||</w:t>
-            </w:r>
-          </w:p>
-        </w:tc>
-        <w:tc>
-          <w:tcPr>
-            <w:tcW w:w="5386" w:type="dxa"/>
-          </w:tcPr>
-          <w:p>
-            <w:pPr>
-              <w:widowControl w:val="0"/>
-              <w:autoSpaceDE w:val="0"/>
-              <w:autoSpaceDN w:val="0"/>
-              <w:adjustRightInd w:val="0"/>
-              <w:spacing w:before="0" w:line="240" w:lineRule="auto"/>
-              <w:rPr>
                 <w:rFonts w:ascii="BRH Malayalam Extra" w:eastAsia="Times New Roman" w:hAnsi="BRH Malayalam Extra" w:cs="BRH Malayalam Extra"/>
                 <w:color w:val="000000"/>
                 <w:sz w:val="40"/>
@@ -7525,28 +7032,9 @@
     </w:tbl>
     <w:p>
       <w:pPr>
-        <w:jc w:val="center"/>
-        <w:rPr>
-          <w:b/>
-          <w:bCs/>
-          <w:sz w:val="32"/>
-          <w:szCs w:val="32"/>
-          <w:u w:val="single"/>
-        </w:rPr>
-      </w:pPr>
-      <w:r>
-        <w:rPr>
-          <w:b/>
-          <w:bCs/>
-          <w:sz w:val="32"/>
-          <w:szCs w:val="32"/>
-          <w:u w:val="single"/>
-        </w:rPr>
-        <w:t>=========</w:t>
-      </w:r>
-    </w:p>
-    <w:p>
-      <w:pPr>
+        <w:pBdr>
+          <w:bottom w:val="double" w:sz="6" w:space="1" w:color="auto"/>
+        </w:pBdr>
         <w:jc w:val="center"/>
         <w:rPr>
           <w:b/>
@@ -7588,6 +7076,7 @@
           <w:szCs w:val="32"/>
           <w:u w:val="single"/>
         </w:rPr>
+        <w:lastRenderedPageBreak/>
         <w:t xml:space="preserve">TS </w:t>
       </w:r>
       <w:r>
@@ -8991,54 +8480,6 @@
         <w:pBdr>
           <w:bottom w:val="double" w:sz="6" w:space="1" w:color="auto"/>
         </w:pBdr>
-        <w:jc w:val="center"/>
-        <w:rPr>
-          <w:b/>
-          <w:bCs/>
-          <w:sz w:val="32"/>
-          <w:szCs w:val="32"/>
-          <w:u w:val="single"/>
-        </w:rPr>
-      </w:pPr>
-    </w:p>
-    <w:p>
-      <w:pPr>
-        <w:jc w:val="center"/>
-        <w:rPr>
-          <w:b/>
-          <w:bCs/>
-          <w:sz w:val="32"/>
-          <w:szCs w:val="32"/>
-          <w:u w:val="single"/>
-        </w:rPr>
-      </w:pPr>
-    </w:p>
-    <w:p>
-      <w:pPr>
-        <w:jc w:val="center"/>
-        <w:rPr>
-          <w:b/>
-          <w:bCs/>
-          <w:sz w:val="32"/>
-          <w:szCs w:val="32"/>
-          <w:u w:val="single"/>
-        </w:rPr>
-      </w:pPr>
-    </w:p>
-    <w:p>
-      <w:pPr>
-        <w:jc w:val="center"/>
-        <w:rPr>
-          <w:b/>
-          <w:bCs/>
-          <w:sz w:val="32"/>
-          <w:szCs w:val="32"/>
-          <w:u w:val="single"/>
-        </w:rPr>
-      </w:pPr>
-    </w:p>
-    <w:p>
-      <w:pPr>
         <w:jc w:val="center"/>
         <w:rPr>
           <w:b/>
@@ -9312,7 +8753,6 @@
                 <w:sz w:val="28"/>
                 <w:szCs w:val="32"/>
               </w:rPr>
-              <w:lastRenderedPageBreak/>
               <w:t>T.S.4.6.2.3 – Kramam</w:t>
             </w:r>
           </w:p>
@@ -9863,7 +9303,23 @@
                 <w:b/>
                 <w:bCs/>
               </w:rPr>
-              <w:t>(it is deergham)</w:t>
+              <w:t xml:space="preserve">(it is </w:t>
+            </w:r>
+            <w:proofErr w:type="spellStart"/>
+            <w:r>
+              <w:rPr>
+                <w:b/>
+                <w:bCs/>
+              </w:rPr>
+              <w:t>deergham</w:t>
+            </w:r>
+            <w:proofErr w:type="spellEnd"/>
+            <w:r>
+              <w:rPr>
+                <w:b/>
+                <w:bCs/>
+              </w:rPr>
+              <w:t>)</w:t>
             </w:r>
           </w:p>
         </w:tc>
@@ -10429,6 +9885,7 @@
                 <w:sz w:val="28"/>
                 <w:szCs w:val="32"/>
               </w:rPr>
+              <w:lastRenderedPageBreak/>
               <w:t>T.S.4.6.5.6 – Kramam</w:t>
             </w:r>
           </w:p>
@@ -11858,12 +11315,21 @@
               </w:rPr>
               <w:t xml:space="preserve"> </w:t>
             </w:r>
-            <w:r>
-              <w:rPr>
-                <w:b/>
-                <w:bCs/>
-              </w:rPr>
-              <w:t>deergham)</w:t>
+            <w:proofErr w:type="spellStart"/>
+            <w:r>
+              <w:rPr>
+                <w:b/>
+                <w:bCs/>
+              </w:rPr>
+              <w:t>deergham</w:t>
+            </w:r>
+            <w:proofErr w:type="spellEnd"/>
+            <w:r>
+              <w:rPr>
+                <w:b/>
+                <w:bCs/>
+              </w:rPr>
+              <w:t>)</w:t>
             </w:r>
           </w:p>
         </w:tc>
@@ -13370,7 +12836,6 @@
                 <w:sz w:val="28"/>
                 <w:szCs w:val="32"/>
               </w:rPr>
-              <w:lastRenderedPageBreak/>
               <w:t>T.S.4.6.8.3 – Kramam</w:t>
             </w:r>
           </w:p>
@@ -14648,6 +14113,7 @@
                 <w:sz w:val="28"/>
                 <w:szCs w:val="32"/>
               </w:rPr>
+              <w:lastRenderedPageBreak/>
               <w:t>T.S.4.6.9.1 – Kramam</w:t>
             </w:r>
           </w:p>
@@ -15534,7 +15000,16 @@
           <w:bCs/>
           <w:sz w:val="32"/>
         </w:rPr>
-        <w:t>replaced with</w:t>
+        <w:t xml:space="preserve">replaced </w:t>
+      </w:r>
+      <w:proofErr w:type="gramStart"/>
+      <w:r>
+        <w:rPr>
+          <w:b/>
+          <w:bCs/>
+          <w:sz w:val="32"/>
+        </w:rPr>
+        <w:t>with</w:t>
       </w:r>
       <w:r>
         <w:rPr>
@@ -15556,6 +15031,7 @@
         </w:rPr>
         <w:t>"</w:t>
       </w:r>
+      <w:proofErr w:type="gramEnd"/>
       <w:r>
         <w:rPr>
           <w:rFonts w:ascii="Latha" w:hAnsi="Latha" w:cs="Latha"/>
@@ -16018,7 +15494,6 @@
           <w:b/>
           <w:sz w:val="32"/>
         </w:rPr>
-        <w:lastRenderedPageBreak/>
         <w:t>===================</w:t>
       </w:r>
     </w:p>
@@ -16119,6 +15594,7 @@
       <w:tab/>
       <w:t xml:space="preserve">              </w:t>
     </w:r>
+    <w:proofErr w:type="gramStart"/>
     <w:r>
       <w:rPr>
         <w:b/>
@@ -16140,6 +15616,7 @@
       </w:rPr>
       <w:tab/>
     </w:r>
+    <w:proofErr w:type="gramEnd"/>
     <w:r>
       <w:rPr>
         <w:b/>

</xml_diff>